<commit_message>
v0.9.38 — net-new .docx generation pipeline + fully pinned legal template
- draft.md gains a --document mode: pandoc + clean_format.py is the prescribed pipeline for generating net-new .docx drafts — never macOS textutil (ignores CSS point sizes, ships oversized text), never legal-template.docx as a pandoc --reference-doc
- the new mode documents what the normalize pass flattens (hyperlinks collapse to anchor text, footnotes drop, images/fields lost, heading auto-numbering) and routes documents needing those features to a direct python-docx build instead
- legal-template.docx: every rFonts in BOTH style parts (styles.xml and the Word-2010 compat stylesWithEffects.xml) now pins Times New Roman with all theme font attributes stripped — OOXML theme aliases supersede explicit fonts, so leftover asciiTheme attributes rendered headings in Cambria/Calibri
- new guard test (browse/src/legal-template-fonts.test.ts) asserts both style parts stay pinned and Normal stays 11pt
</commit_message>
<xml_diff>
--- a/scripts/legal-template.docx
+++ b/scripts/legal-template.docx
@@ -220,7 +220,7 @@
   <w:docDefaults>
     <w:rPrDefault>
       <w:rPr>
-        <w:rFonts w:asciiTheme="minorHAnsi" w:eastAsiaTheme="minorEastAsia" w:hAnsiTheme="minorHAnsi" w:cstheme="minorBidi"/>
+        <w:rFonts w:ascii="Times New Roman" w:hAnsi="Times New Roman" w:cs="Times New Roman" w:eastAsia="Times New Roman"/>
         <w:sz w:val="22"/>
         <w:szCs w:val="22"/>
         <w:lang w:val="en-US" w:eastAsia="en-US" w:bidi="ar-SA"/>
@@ -380,9 +380,9 @@
       <w:jc w:val="both"/>
     </w:pPr>
     <w:rPr>
-      <w:rFonts w:ascii="Calibri" w:hAnsi="Calibri"/>
+      <w:rFonts w:ascii="Times New Roman" w:hAnsi="Times New Roman" w:cs="Times New Roman" w:eastAsia="Times New Roman"/>
       <w:color w:val="1A1A1A"/>
-      <w:sz w:val="20"/>
+      <w:sz w:val="22"/>
     </w:rPr>
   </w:style>
   <w:style w:type="paragraph" w:styleId="Header">
@@ -445,7 +445,7 @@
       <w:outlineLvl w:val="0"/>
     </w:pPr>
     <w:rPr>
-      <w:rFonts w:asciiTheme="majorHAnsi" w:eastAsiaTheme="majorEastAsia" w:hAnsiTheme="majorHAnsi" w:cstheme="majorBidi" w:ascii="Calibri" w:hAnsi="Calibri"/>
+      <w:rFonts w:ascii="Times New Roman" w:hAnsi="Times New Roman" w:cs="Times New Roman" w:eastAsia="Times New Roman"/>
       <w:b/>
       <w:bCs/>
       <w:color w:val="1A1A1A"/>
@@ -470,7 +470,7 @@
       <w:outlineLvl w:val="1"/>
     </w:pPr>
     <w:rPr>
-      <w:rFonts w:asciiTheme="majorHAnsi" w:eastAsiaTheme="majorEastAsia" w:hAnsiTheme="majorHAnsi" w:cstheme="majorBidi" w:ascii="Calibri" w:hAnsi="Calibri"/>
+      <w:rFonts w:ascii="Times New Roman" w:hAnsi="Times New Roman" w:cs="Times New Roman" w:eastAsia="Times New Roman"/>
       <w:b/>
       <w:bCs/>
       <w:color w:val="1A1A1A"/>
@@ -495,7 +495,7 @@
       <w:outlineLvl w:val="2"/>
     </w:pPr>
     <w:rPr>
-      <w:rFonts w:asciiTheme="majorHAnsi" w:eastAsiaTheme="majorEastAsia" w:hAnsiTheme="majorHAnsi" w:cstheme="majorBidi" w:ascii="Calibri" w:hAnsi="Calibri"/>
+      <w:rFonts w:ascii="Times New Roman" w:hAnsi="Times New Roman" w:cs="Times New Roman" w:eastAsia="Times New Roman"/>
       <w:b/>
       <w:bCs/>
       <w:color w:val="1A1A1A"/>
@@ -519,7 +519,7 @@
       <w:outlineLvl w:val="3"/>
     </w:pPr>
     <w:rPr>
-      <w:rFonts w:asciiTheme="majorHAnsi" w:eastAsiaTheme="majorEastAsia" w:hAnsiTheme="majorHAnsi" w:cstheme="majorBidi"/>
+      <w:rFonts w:ascii="Times New Roman" w:hAnsi="Times New Roman" w:eastAsia="Times New Roman" w:cs="Times New Roman"/>
       <w:b/>
       <w:bCs/>
       <w:i/>
@@ -544,7 +544,7 @@
       <w:outlineLvl w:val="4"/>
     </w:pPr>
     <w:rPr>
-      <w:rFonts w:asciiTheme="majorHAnsi" w:eastAsiaTheme="majorEastAsia" w:hAnsiTheme="majorHAnsi" w:cstheme="majorBidi"/>
+      <w:rFonts w:ascii="Times New Roman" w:hAnsi="Times New Roman" w:eastAsia="Times New Roman" w:cs="Times New Roman"/>
       <w:color w:val="243F60" w:themeColor="accent1" w:themeShade="7F"/>
     </w:rPr>
   </w:style>
@@ -565,7 +565,7 @@
       <w:outlineLvl w:val="5"/>
     </w:pPr>
     <w:rPr>
-      <w:rFonts w:asciiTheme="majorHAnsi" w:eastAsiaTheme="majorEastAsia" w:hAnsiTheme="majorHAnsi" w:cstheme="majorBidi"/>
+      <w:rFonts w:ascii="Times New Roman" w:hAnsi="Times New Roman" w:eastAsia="Times New Roman" w:cs="Times New Roman"/>
       <w:i/>
       <w:iCs/>
       <w:color w:val="243F60" w:themeColor="accent1" w:themeShade="7F"/>
@@ -588,7 +588,7 @@
       <w:outlineLvl w:val="6"/>
     </w:pPr>
     <w:rPr>
-      <w:rFonts w:asciiTheme="majorHAnsi" w:eastAsiaTheme="majorEastAsia" w:hAnsiTheme="majorHAnsi" w:cstheme="majorBidi"/>
+      <w:rFonts w:ascii="Times New Roman" w:hAnsi="Times New Roman" w:eastAsia="Times New Roman" w:cs="Times New Roman"/>
       <w:i/>
       <w:iCs/>
       <w:color w:val="404040" w:themeColor="text1" w:themeTint="BF"/>
@@ -611,7 +611,7 @@
       <w:outlineLvl w:val="7"/>
     </w:pPr>
     <w:rPr>
-      <w:rFonts w:asciiTheme="majorHAnsi" w:eastAsiaTheme="majorEastAsia" w:hAnsiTheme="majorHAnsi" w:cstheme="majorBidi"/>
+      <w:rFonts w:ascii="Times New Roman" w:hAnsi="Times New Roman" w:eastAsia="Times New Roman" w:cs="Times New Roman"/>
       <w:color w:val="4F81BD" w:themeColor="accent1"/>
       <w:sz w:val="20"/>
       <w:szCs w:val="20"/>
@@ -634,7 +634,7 @@
       <w:outlineLvl w:val="8"/>
     </w:pPr>
     <w:rPr>
-      <w:rFonts w:asciiTheme="majorHAnsi" w:eastAsiaTheme="majorEastAsia" w:hAnsiTheme="majorHAnsi" w:cstheme="majorBidi"/>
+      <w:rFonts w:ascii="Times New Roman" w:hAnsi="Times New Roman" w:eastAsia="Times New Roman" w:cs="Times New Roman"/>
       <w:i/>
       <w:iCs/>
       <w:color w:val="404040" w:themeColor="text1" w:themeTint="BF"/>
@@ -685,7 +685,7 @@
     <w:uiPriority w:val="9"/>
     <w:rsid w:val="00FC693F"/>
     <w:rPr>
-      <w:rFonts w:asciiTheme="majorHAnsi" w:eastAsiaTheme="majorEastAsia" w:hAnsiTheme="majorHAnsi" w:cstheme="majorBidi"/>
+      <w:rFonts w:ascii="Times New Roman" w:hAnsi="Times New Roman" w:eastAsia="Times New Roman" w:cs="Times New Roman"/>
       <w:b/>
       <w:bCs/>
       <w:color w:val="365F91" w:themeColor="accent1" w:themeShade="BF"/>
@@ -700,7 +700,7 @@
     <w:uiPriority w:val="9"/>
     <w:rsid w:val="00FC693F"/>
     <w:rPr>
-      <w:rFonts w:asciiTheme="majorHAnsi" w:eastAsiaTheme="majorEastAsia" w:hAnsiTheme="majorHAnsi" w:cstheme="majorBidi"/>
+      <w:rFonts w:ascii="Times New Roman" w:hAnsi="Times New Roman" w:eastAsia="Times New Roman" w:cs="Times New Roman"/>
       <w:b/>
       <w:bCs/>
       <w:color w:val="4F81BD" w:themeColor="accent1"/>
@@ -715,7 +715,7 @@
     <w:uiPriority w:val="9"/>
     <w:rsid w:val="00FC693F"/>
     <w:rPr>
-      <w:rFonts w:asciiTheme="majorHAnsi" w:eastAsiaTheme="majorEastAsia" w:hAnsiTheme="majorHAnsi" w:cstheme="majorBidi"/>
+      <w:rFonts w:ascii="Times New Roman" w:hAnsi="Times New Roman" w:eastAsia="Times New Roman" w:cs="Times New Roman"/>
       <w:b/>
       <w:bCs/>
       <w:color w:val="4F81BD" w:themeColor="accent1"/>
@@ -738,7 +738,7 @@
       <w:jc w:val="center"/>
     </w:pPr>
     <w:rPr>
-      <w:rFonts w:asciiTheme="majorHAnsi" w:eastAsiaTheme="majorEastAsia" w:hAnsiTheme="majorHAnsi" w:cstheme="majorBidi" w:ascii="Calibri" w:hAnsi="Calibri"/>
+      <w:rFonts w:ascii="Times New Roman" w:hAnsi="Times New Roman" w:cs="Times New Roman" w:eastAsia="Times New Roman"/>
       <w:b/>
       <w:color w:val="1A1A1A"/>
       <w:spacing w:val="5"/>
@@ -754,7 +754,7 @@
     <w:uiPriority w:val="10"/>
     <w:rsid w:val="00FC693F"/>
     <w:rPr>
-      <w:rFonts w:asciiTheme="majorHAnsi" w:eastAsiaTheme="majorEastAsia" w:hAnsiTheme="majorHAnsi" w:cstheme="majorBidi"/>
+      <w:rFonts w:ascii="Times New Roman" w:hAnsi="Times New Roman" w:eastAsia="Times New Roman" w:cs="Times New Roman"/>
       <w:color w:val="17365D" w:themeColor="text2" w:themeShade="BF"/>
       <w:spacing w:val="5"/>
       <w:kern w:val="28"/>
@@ -776,7 +776,7 @@
       </w:numPr>
     </w:pPr>
     <w:rPr>
-      <w:rFonts w:asciiTheme="majorHAnsi" w:eastAsiaTheme="majorEastAsia" w:hAnsiTheme="majorHAnsi" w:cstheme="majorBidi"/>
+      <w:rFonts w:ascii="Times New Roman" w:hAnsi="Times New Roman" w:eastAsia="Times New Roman" w:cs="Times New Roman"/>
       <w:i/>
       <w:iCs/>
       <w:color w:val="4F81BD" w:themeColor="accent1"/>
@@ -792,7 +792,7 @@
     <w:uiPriority w:val="11"/>
     <w:rsid w:val="00FC693F"/>
     <w:rPr>
-      <w:rFonts w:asciiTheme="majorHAnsi" w:eastAsiaTheme="majorEastAsia" w:hAnsiTheme="majorHAnsi" w:cstheme="majorBidi"/>
+      <w:rFonts w:ascii="Times New Roman" w:hAnsi="Times New Roman" w:eastAsia="Times New Roman" w:cs="Times New Roman"/>
       <w:i/>
       <w:iCs/>
       <w:color w:val="4F81BD" w:themeColor="accent1"/>
@@ -1039,7 +1039,7 @@
       </w:tabs>
     </w:pPr>
     <w:rPr>
-      <w:rFonts w:ascii="Courier" w:hAnsi="Courier"/>
+      <w:rFonts w:ascii="Times New Roman" w:hAnsi="Times New Roman" w:eastAsia="Times New Roman" w:cs="Times New Roman"/>
       <w:sz w:val="20"/>
       <w:szCs w:val="20"/>
     </w:rPr>
@@ -1051,7 +1051,7 @@
     <w:uiPriority w:val="99"/>
     <w:rsid w:val="0029639D"/>
     <w:rPr>
-      <w:rFonts w:ascii="Courier" w:hAnsi="Courier"/>
+      <w:rFonts w:ascii="Times New Roman" w:hAnsi="Times New Roman" w:eastAsia="Times New Roman" w:cs="Times New Roman"/>
       <w:sz w:val="20"/>
       <w:szCs w:val="20"/>
     </w:rPr>
@@ -1090,7 +1090,7 @@
     <w:semiHidden/>
     <w:rsid w:val="00FC693F"/>
     <w:rPr>
-      <w:rFonts w:asciiTheme="majorHAnsi" w:eastAsiaTheme="majorEastAsia" w:hAnsiTheme="majorHAnsi" w:cstheme="majorBidi"/>
+      <w:rFonts w:ascii="Times New Roman" w:hAnsi="Times New Roman" w:eastAsia="Times New Roman" w:cs="Times New Roman"/>
       <w:b/>
       <w:bCs/>
       <w:i/>
@@ -1106,7 +1106,7 @@
     <w:semiHidden/>
     <w:rsid w:val="00FC693F"/>
     <w:rPr>
-      <w:rFonts w:asciiTheme="majorHAnsi" w:eastAsiaTheme="majorEastAsia" w:hAnsiTheme="majorHAnsi" w:cstheme="majorBidi"/>
+      <w:rFonts w:ascii="Times New Roman" w:hAnsi="Times New Roman" w:eastAsia="Times New Roman" w:cs="Times New Roman"/>
       <w:color w:val="243F60" w:themeColor="accent1" w:themeShade="7F"/>
     </w:rPr>
   </w:style>
@@ -1118,7 +1118,7 @@
     <w:semiHidden/>
     <w:rsid w:val="00FC693F"/>
     <w:rPr>
-      <w:rFonts w:asciiTheme="majorHAnsi" w:eastAsiaTheme="majorEastAsia" w:hAnsiTheme="majorHAnsi" w:cstheme="majorBidi"/>
+      <w:rFonts w:ascii="Times New Roman" w:hAnsi="Times New Roman" w:eastAsia="Times New Roman" w:cs="Times New Roman"/>
       <w:i/>
       <w:iCs/>
       <w:color w:val="243F60" w:themeColor="accent1" w:themeShade="7F"/>
@@ -1132,7 +1132,7 @@
     <w:semiHidden/>
     <w:rsid w:val="00FC693F"/>
     <w:rPr>
-      <w:rFonts w:asciiTheme="majorHAnsi" w:eastAsiaTheme="majorEastAsia" w:hAnsiTheme="majorHAnsi" w:cstheme="majorBidi"/>
+      <w:rFonts w:ascii="Times New Roman" w:hAnsi="Times New Roman" w:eastAsia="Times New Roman" w:cs="Times New Roman"/>
       <w:i/>
       <w:iCs/>
       <w:color w:val="404040" w:themeColor="text1" w:themeTint="BF"/>
@@ -1146,7 +1146,7 @@
     <w:semiHidden/>
     <w:rsid w:val="00FC693F"/>
     <w:rPr>
-      <w:rFonts w:asciiTheme="majorHAnsi" w:eastAsiaTheme="majorEastAsia" w:hAnsiTheme="majorHAnsi" w:cstheme="majorBidi"/>
+      <w:rFonts w:ascii="Times New Roman" w:hAnsi="Times New Roman" w:eastAsia="Times New Roman" w:cs="Times New Roman"/>
       <w:color w:val="4F81BD" w:themeColor="accent1"/>
       <w:sz w:val="20"/>
       <w:szCs w:val="20"/>
@@ -1160,7 +1160,7 @@
     <w:semiHidden/>
     <w:rsid w:val="00FC693F"/>
     <w:rPr>
-      <w:rFonts w:asciiTheme="majorHAnsi" w:eastAsiaTheme="majorEastAsia" w:hAnsiTheme="majorHAnsi" w:cstheme="majorBidi"/>
+      <w:rFonts w:ascii="Times New Roman" w:hAnsi="Times New Roman" w:eastAsia="Times New Roman" w:cs="Times New Roman"/>
       <w:i/>
       <w:iCs/>
       <w:color w:val="404040" w:themeColor="text1" w:themeTint="BF"/>
@@ -2749,7 +2749,7 @@
         <w:spacing w:before="0" w:after="0" w:line="240" w:lineRule="auto"/>
       </w:pPr>
       <w:rPr>
-        <w:rFonts w:asciiTheme="majorHAnsi" w:eastAsiaTheme="majorEastAsia" w:hAnsiTheme="majorHAnsi" w:cstheme="majorBidi"/>
+        <w:rFonts w:ascii="Times New Roman" w:hAnsi="Times New Roman" w:eastAsia="Times New Roman" w:cs="Times New Roman"/>
         <w:b/>
         <w:bCs/>
       </w:rPr>
@@ -2770,7 +2770,7 @@
         <w:spacing w:before="0" w:after="0" w:line="240" w:lineRule="auto"/>
       </w:pPr>
       <w:rPr>
-        <w:rFonts w:asciiTheme="majorHAnsi" w:eastAsiaTheme="majorEastAsia" w:hAnsiTheme="majorHAnsi" w:cstheme="majorBidi"/>
+        <w:rFonts w:ascii="Times New Roman" w:hAnsi="Times New Roman" w:eastAsia="Times New Roman" w:cs="Times New Roman"/>
         <w:b/>
         <w:bCs/>
       </w:rPr>
@@ -2788,14 +2788,14 @@
     </w:tblStylePr>
     <w:tblStylePr w:type="firstCol">
       <w:rPr>
-        <w:rFonts w:asciiTheme="majorHAnsi" w:eastAsiaTheme="majorEastAsia" w:hAnsiTheme="majorHAnsi" w:cstheme="majorBidi"/>
+        <w:rFonts w:ascii="Times New Roman" w:hAnsi="Times New Roman" w:eastAsia="Times New Roman" w:cs="Times New Roman"/>
         <w:b/>
         <w:bCs/>
       </w:rPr>
     </w:tblStylePr>
     <w:tblStylePr w:type="lastCol">
       <w:rPr>
-        <w:rFonts w:asciiTheme="majorHAnsi" w:eastAsiaTheme="majorEastAsia" w:hAnsiTheme="majorHAnsi" w:cstheme="majorBidi"/>
+        <w:rFonts w:ascii="Times New Roman" w:hAnsi="Times New Roman" w:eastAsia="Times New Roman" w:cs="Times New Roman"/>
         <w:b/>
         <w:bCs/>
       </w:rPr>
@@ -2879,7 +2879,7 @@
         <w:spacing w:before="0" w:after="0" w:line="240" w:lineRule="auto"/>
       </w:pPr>
       <w:rPr>
-        <w:rFonts w:asciiTheme="majorHAnsi" w:eastAsiaTheme="majorEastAsia" w:hAnsiTheme="majorHAnsi" w:cstheme="majorBidi"/>
+        <w:rFonts w:ascii="Times New Roman" w:hAnsi="Times New Roman" w:eastAsia="Times New Roman" w:cs="Times New Roman"/>
         <w:b/>
         <w:bCs/>
       </w:rPr>
@@ -2900,7 +2900,7 @@
         <w:spacing w:before="0" w:after="0" w:line="240" w:lineRule="auto"/>
       </w:pPr>
       <w:rPr>
-        <w:rFonts w:asciiTheme="majorHAnsi" w:eastAsiaTheme="majorEastAsia" w:hAnsiTheme="majorHAnsi" w:cstheme="majorBidi"/>
+        <w:rFonts w:ascii="Times New Roman" w:hAnsi="Times New Roman" w:eastAsia="Times New Roman" w:cs="Times New Roman"/>
         <w:b/>
         <w:bCs/>
       </w:rPr>
@@ -2918,14 +2918,14 @@
     </w:tblStylePr>
     <w:tblStylePr w:type="firstCol">
       <w:rPr>
-        <w:rFonts w:asciiTheme="majorHAnsi" w:eastAsiaTheme="majorEastAsia" w:hAnsiTheme="majorHAnsi" w:cstheme="majorBidi"/>
+        <w:rFonts w:ascii="Times New Roman" w:hAnsi="Times New Roman" w:eastAsia="Times New Roman" w:cs="Times New Roman"/>
         <w:b/>
         <w:bCs/>
       </w:rPr>
     </w:tblStylePr>
     <w:tblStylePr w:type="lastCol">
       <w:rPr>
-        <w:rFonts w:asciiTheme="majorHAnsi" w:eastAsiaTheme="majorEastAsia" w:hAnsiTheme="majorHAnsi" w:cstheme="majorBidi"/>
+        <w:rFonts w:ascii="Times New Roman" w:hAnsi="Times New Roman" w:eastAsia="Times New Roman" w:cs="Times New Roman"/>
         <w:b/>
         <w:bCs/>
       </w:rPr>
@@ -3009,7 +3009,7 @@
         <w:spacing w:before="0" w:after="0" w:line="240" w:lineRule="auto"/>
       </w:pPr>
       <w:rPr>
-        <w:rFonts w:asciiTheme="majorHAnsi" w:eastAsiaTheme="majorEastAsia" w:hAnsiTheme="majorHAnsi" w:cstheme="majorBidi"/>
+        <w:rFonts w:ascii="Times New Roman" w:hAnsi="Times New Roman" w:eastAsia="Times New Roman" w:cs="Times New Roman"/>
         <w:b/>
         <w:bCs/>
       </w:rPr>
@@ -3030,7 +3030,7 @@
         <w:spacing w:before="0" w:after="0" w:line="240" w:lineRule="auto"/>
       </w:pPr>
       <w:rPr>
-        <w:rFonts w:asciiTheme="majorHAnsi" w:eastAsiaTheme="majorEastAsia" w:hAnsiTheme="majorHAnsi" w:cstheme="majorBidi"/>
+        <w:rFonts w:ascii="Times New Roman" w:hAnsi="Times New Roman" w:eastAsia="Times New Roman" w:cs="Times New Roman"/>
         <w:b/>
         <w:bCs/>
       </w:rPr>
@@ -3048,14 +3048,14 @@
     </w:tblStylePr>
     <w:tblStylePr w:type="firstCol">
       <w:rPr>
-        <w:rFonts w:asciiTheme="majorHAnsi" w:eastAsiaTheme="majorEastAsia" w:hAnsiTheme="majorHAnsi" w:cstheme="majorBidi"/>
+        <w:rFonts w:ascii="Times New Roman" w:hAnsi="Times New Roman" w:eastAsia="Times New Roman" w:cs="Times New Roman"/>
         <w:b/>
         <w:bCs/>
       </w:rPr>
     </w:tblStylePr>
     <w:tblStylePr w:type="lastCol">
       <w:rPr>
-        <w:rFonts w:asciiTheme="majorHAnsi" w:eastAsiaTheme="majorEastAsia" w:hAnsiTheme="majorHAnsi" w:cstheme="majorBidi"/>
+        <w:rFonts w:ascii="Times New Roman" w:hAnsi="Times New Roman" w:eastAsia="Times New Roman" w:cs="Times New Roman"/>
         <w:b/>
         <w:bCs/>
       </w:rPr>
@@ -3139,7 +3139,7 @@
         <w:spacing w:before="0" w:after="0" w:line="240" w:lineRule="auto"/>
       </w:pPr>
       <w:rPr>
-        <w:rFonts w:asciiTheme="majorHAnsi" w:eastAsiaTheme="majorEastAsia" w:hAnsiTheme="majorHAnsi" w:cstheme="majorBidi"/>
+        <w:rFonts w:ascii="Times New Roman" w:hAnsi="Times New Roman" w:eastAsia="Times New Roman" w:cs="Times New Roman"/>
         <w:b/>
         <w:bCs/>
       </w:rPr>
@@ -3160,7 +3160,7 @@
         <w:spacing w:before="0" w:after="0" w:line="240" w:lineRule="auto"/>
       </w:pPr>
       <w:rPr>
-        <w:rFonts w:asciiTheme="majorHAnsi" w:eastAsiaTheme="majorEastAsia" w:hAnsiTheme="majorHAnsi" w:cstheme="majorBidi"/>
+        <w:rFonts w:ascii="Times New Roman" w:hAnsi="Times New Roman" w:eastAsia="Times New Roman" w:cs="Times New Roman"/>
         <w:b/>
         <w:bCs/>
       </w:rPr>
@@ -3178,14 +3178,14 @@
     </w:tblStylePr>
     <w:tblStylePr w:type="firstCol">
       <w:rPr>
-        <w:rFonts w:asciiTheme="majorHAnsi" w:eastAsiaTheme="majorEastAsia" w:hAnsiTheme="majorHAnsi" w:cstheme="majorBidi"/>
+        <w:rFonts w:ascii="Times New Roman" w:hAnsi="Times New Roman" w:eastAsia="Times New Roman" w:cs="Times New Roman"/>
         <w:b/>
         <w:bCs/>
       </w:rPr>
     </w:tblStylePr>
     <w:tblStylePr w:type="lastCol">
       <w:rPr>
-        <w:rFonts w:asciiTheme="majorHAnsi" w:eastAsiaTheme="majorEastAsia" w:hAnsiTheme="majorHAnsi" w:cstheme="majorBidi"/>
+        <w:rFonts w:ascii="Times New Roman" w:hAnsi="Times New Roman" w:eastAsia="Times New Roman" w:cs="Times New Roman"/>
         <w:b/>
         <w:bCs/>
       </w:rPr>
@@ -3269,7 +3269,7 @@
         <w:spacing w:before="0" w:after="0" w:line="240" w:lineRule="auto"/>
       </w:pPr>
       <w:rPr>
-        <w:rFonts w:asciiTheme="majorHAnsi" w:eastAsiaTheme="majorEastAsia" w:hAnsiTheme="majorHAnsi" w:cstheme="majorBidi"/>
+        <w:rFonts w:ascii="Times New Roman" w:hAnsi="Times New Roman" w:eastAsia="Times New Roman" w:cs="Times New Roman"/>
         <w:b/>
         <w:bCs/>
       </w:rPr>
@@ -3290,7 +3290,7 @@
         <w:spacing w:before="0" w:after="0" w:line="240" w:lineRule="auto"/>
       </w:pPr>
       <w:rPr>
-        <w:rFonts w:asciiTheme="majorHAnsi" w:eastAsiaTheme="majorEastAsia" w:hAnsiTheme="majorHAnsi" w:cstheme="majorBidi"/>
+        <w:rFonts w:ascii="Times New Roman" w:hAnsi="Times New Roman" w:eastAsia="Times New Roman" w:cs="Times New Roman"/>
         <w:b/>
         <w:bCs/>
       </w:rPr>
@@ -3308,14 +3308,14 @@
     </w:tblStylePr>
     <w:tblStylePr w:type="firstCol">
       <w:rPr>
-        <w:rFonts w:asciiTheme="majorHAnsi" w:eastAsiaTheme="majorEastAsia" w:hAnsiTheme="majorHAnsi" w:cstheme="majorBidi"/>
+        <w:rFonts w:ascii="Times New Roman" w:hAnsi="Times New Roman" w:eastAsia="Times New Roman" w:cs="Times New Roman"/>
         <w:b/>
         <w:bCs/>
       </w:rPr>
     </w:tblStylePr>
     <w:tblStylePr w:type="lastCol">
       <w:rPr>
-        <w:rFonts w:asciiTheme="majorHAnsi" w:eastAsiaTheme="majorEastAsia" w:hAnsiTheme="majorHAnsi" w:cstheme="majorBidi"/>
+        <w:rFonts w:ascii="Times New Roman" w:hAnsi="Times New Roman" w:eastAsia="Times New Roman" w:cs="Times New Roman"/>
         <w:b/>
         <w:bCs/>
       </w:rPr>
@@ -3399,7 +3399,7 @@
         <w:spacing w:before="0" w:after="0" w:line="240" w:lineRule="auto"/>
       </w:pPr>
       <w:rPr>
-        <w:rFonts w:asciiTheme="majorHAnsi" w:eastAsiaTheme="majorEastAsia" w:hAnsiTheme="majorHAnsi" w:cstheme="majorBidi"/>
+        <w:rFonts w:ascii="Times New Roman" w:hAnsi="Times New Roman" w:eastAsia="Times New Roman" w:cs="Times New Roman"/>
         <w:b/>
         <w:bCs/>
       </w:rPr>
@@ -3420,7 +3420,7 @@
         <w:spacing w:before="0" w:after="0" w:line="240" w:lineRule="auto"/>
       </w:pPr>
       <w:rPr>
-        <w:rFonts w:asciiTheme="majorHAnsi" w:eastAsiaTheme="majorEastAsia" w:hAnsiTheme="majorHAnsi" w:cstheme="majorBidi"/>
+        <w:rFonts w:ascii="Times New Roman" w:hAnsi="Times New Roman" w:eastAsia="Times New Roman" w:cs="Times New Roman"/>
         <w:b/>
         <w:bCs/>
       </w:rPr>
@@ -3438,14 +3438,14 @@
     </w:tblStylePr>
     <w:tblStylePr w:type="firstCol">
       <w:rPr>
-        <w:rFonts w:asciiTheme="majorHAnsi" w:eastAsiaTheme="majorEastAsia" w:hAnsiTheme="majorHAnsi" w:cstheme="majorBidi"/>
+        <w:rFonts w:ascii="Times New Roman" w:hAnsi="Times New Roman" w:eastAsia="Times New Roman" w:cs="Times New Roman"/>
         <w:b/>
         <w:bCs/>
       </w:rPr>
     </w:tblStylePr>
     <w:tblStylePr w:type="lastCol">
       <w:rPr>
-        <w:rFonts w:asciiTheme="majorHAnsi" w:eastAsiaTheme="majorEastAsia" w:hAnsiTheme="majorHAnsi" w:cstheme="majorBidi"/>
+        <w:rFonts w:ascii="Times New Roman" w:hAnsi="Times New Roman" w:eastAsia="Times New Roman" w:cs="Times New Roman"/>
         <w:b/>
         <w:bCs/>
       </w:rPr>
@@ -3529,7 +3529,7 @@
         <w:spacing w:before="0" w:after="0" w:line="240" w:lineRule="auto"/>
       </w:pPr>
       <w:rPr>
-        <w:rFonts w:asciiTheme="majorHAnsi" w:eastAsiaTheme="majorEastAsia" w:hAnsiTheme="majorHAnsi" w:cstheme="majorBidi"/>
+        <w:rFonts w:ascii="Times New Roman" w:hAnsi="Times New Roman" w:eastAsia="Times New Roman" w:cs="Times New Roman"/>
         <w:b/>
         <w:bCs/>
       </w:rPr>
@@ -3550,7 +3550,7 @@
         <w:spacing w:before="0" w:after="0" w:line="240" w:lineRule="auto"/>
       </w:pPr>
       <w:rPr>
-        <w:rFonts w:asciiTheme="majorHAnsi" w:eastAsiaTheme="majorEastAsia" w:hAnsiTheme="majorHAnsi" w:cstheme="majorBidi"/>
+        <w:rFonts w:ascii="Times New Roman" w:hAnsi="Times New Roman" w:eastAsia="Times New Roman" w:cs="Times New Roman"/>
         <w:b/>
         <w:bCs/>
       </w:rPr>
@@ -3568,14 +3568,14 @@
     </w:tblStylePr>
     <w:tblStylePr w:type="firstCol">
       <w:rPr>
-        <w:rFonts w:asciiTheme="majorHAnsi" w:eastAsiaTheme="majorEastAsia" w:hAnsiTheme="majorHAnsi" w:cstheme="majorBidi"/>
+        <w:rFonts w:ascii="Times New Roman" w:hAnsi="Times New Roman" w:eastAsia="Times New Roman" w:cs="Times New Roman"/>
         <w:b/>
         <w:bCs/>
       </w:rPr>
     </w:tblStylePr>
     <w:tblStylePr w:type="lastCol">
       <w:rPr>
-        <w:rFonts w:asciiTheme="majorHAnsi" w:eastAsiaTheme="majorEastAsia" w:hAnsiTheme="majorHAnsi" w:cstheme="majorBidi"/>
+        <w:rFonts w:ascii="Times New Roman" w:hAnsi="Times New Roman" w:eastAsia="Times New Roman" w:cs="Times New Roman"/>
         <w:b/>
         <w:bCs/>
       </w:rPr>
@@ -5440,7 +5440,7 @@
     </w:tblPr>
     <w:tblStylePr w:type="firstRow">
       <w:rPr>
-        <w:rFonts w:asciiTheme="majorHAnsi" w:eastAsiaTheme="majorEastAsia" w:hAnsiTheme="majorHAnsi" w:cstheme="majorBidi"/>
+        <w:rFonts w:ascii="Times New Roman" w:hAnsi="Times New Roman" w:eastAsia="Times New Roman" w:cs="Times New Roman"/>
       </w:rPr>
       <w:tblPr/>
       <w:tcPr>
@@ -5524,7 +5524,7 @@
     </w:tblPr>
     <w:tblStylePr w:type="firstRow">
       <w:rPr>
-        <w:rFonts w:asciiTheme="majorHAnsi" w:eastAsiaTheme="majorEastAsia" w:hAnsiTheme="majorHAnsi" w:cstheme="majorBidi"/>
+        <w:rFonts w:ascii="Times New Roman" w:hAnsi="Times New Roman" w:eastAsia="Times New Roman" w:cs="Times New Roman"/>
       </w:rPr>
       <w:tblPr/>
       <w:tcPr>
@@ -5608,7 +5608,7 @@
     </w:tblPr>
     <w:tblStylePr w:type="firstRow">
       <w:rPr>
-        <w:rFonts w:asciiTheme="majorHAnsi" w:eastAsiaTheme="majorEastAsia" w:hAnsiTheme="majorHAnsi" w:cstheme="majorBidi"/>
+        <w:rFonts w:ascii="Times New Roman" w:hAnsi="Times New Roman" w:eastAsia="Times New Roman" w:cs="Times New Roman"/>
       </w:rPr>
       <w:tblPr/>
       <w:tcPr>
@@ -5692,7 +5692,7 @@
     </w:tblPr>
     <w:tblStylePr w:type="firstRow">
       <w:rPr>
-        <w:rFonts w:asciiTheme="majorHAnsi" w:eastAsiaTheme="majorEastAsia" w:hAnsiTheme="majorHAnsi" w:cstheme="majorBidi"/>
+        <w:rFonts w:ascii="Times New Roman" w:hAnsi="Times New Roman" w:eastAsia="Times New Roman" w:cs="Times New Roman"/>
       </w:rPr>
       <w:tblPr/>
       <w:tcPr>
@@ -5776,7 +5776,7 @@
     </w:tblPr>
     <w:tblStylePr w:type="firstRow">
       <w:rPr>
-        <w:rFonts w:asciiTheme="majorHAnsi" w:eastAsiaTheme="majorEastAsia" w:hAnsiTheme="majorHAnsi" w:cstheme="majorBidi"/>
+        <w:rFonts w:ascii="Times New Roman" w:hAnsi="Times New Roman" w:eastAsia="Times New Roman" w:cs="Times New Roman"/>
       </w:rPr>
       <w:tblPr/>
       <w:tcPr>
@@ -5860,7 +5860,7 @@
     </w:tblPr>
     <w:tblStylePr w:type="firstRow">
       <w:rPr>
-        <w:rFonts w:asciiTheme="majorHAnsi" w:eastAsiaTheme="majorEastAsia" w:hAnsiTheme="majorHAnsi" w:cstheme="majorBidi"/>
+        <w:rFonts w:ascii="Times New Roman" w:hAnsi="Times New Roman" w:eastAsia="Times New Roman" w:cs="Times New Roman"/>
       </w:rPr>
       <w:tblPr/>
       <w:tcPr>
@@ -5944,7 +5944,7 @@
     </w:tblPr>
     <w:tblStylePr w:type="firstRow">
       <w:rPr>
-        <w:rFonts w:asciiTheme="majorHAnsi" w:eastAsiaTheme="majorEastAsia" w:hAnsiTheme="majorHAnsi" w:cstheme="majorBidi"/>
+        <w:rFonts w:ascii="Times New Roman" w:hAnsi="Times New Roman" w:eastAsia="Times New Roman" w:cs="Times New Roman"/>
       </w:rPr>
       <w:tblPr/>
       <w:tcPr>
@@ -6009,7 +6009,7 @@
       <w:spacing w:after="0" w:line="240" w:lineRule="auto"/>
     </w:pPr>
     <w:rPr>
-      <w:rFonts w:asciiTheme="majorHAnsi" w:eastAsiaTheme="majorEastAsia" w:hAnsiTheme="majorHAnsi" w:cstheme="majorBidi"/>
+      <w:rFonts w:ascii="Times New Roman" w:hAnsi="Times New Roman" w:eastAsia="Times New Roman" w:cs="Times New Roman"/>
       <w:color w:val="000000" w:themeColor="text1"/>
     </w:rPr>
     <w:tblPr>
@@ -6137,7 +6137,7 @@
       <w:spacing w:after="0" w:line="240" w:lineRule="auto"/>
     </w:pPr>
     <w:rPr>
-      <w:rFonts w:asciiTheme="majorHAnsi" w:eastAsiaTheme="majorEastAsia" w:hAnsiTheme="majorHAnsi" w:cstheme="majorBidi"/>
+      <w:rFonts w:ascii="Times New Roman" w:hAnsi="Times New Roman" w:eastAsia="Times New Roman" w:cs="Times New Roman"/>
       <w:color w:val="000000" w:themeColor="text1"/>
     </w:rPr>
     <w:tblPr>
@@ -6265,7 +6265,7 @@
       <w:spacing w:after="0" w:line="240" w:lineRule="auto"/>
     </w:pPr>
     <w:rPr>
-      <w:rFonts w:asciiTheme="majorHAnsi" w:eastAsiaTheme="majorEastAsia" w:hAnsiTheme="majorHAnsi" w:cstheme="majorBidi"/>
+      <w:rFonts w:ascii="Times New Roman" w:hAnsi="Times New Roman" w:eastAsia="Times New Roman" w:cs="Times New Roman"/>
       <w:color w:val="000000" w:themeColor="text1"/>
     </w:rPr>
     <w:tblPr>
@@ -6393,7 +6393,7 @@
       <w:spacing w:after="0" w:line="240" w:lineRule="auto"/>
     </w:pPr>
     <w:rPr>
-      <w:rFonts w:asciiTheme="majorHAnsi" w:eastAsiaTheme="majorEastAsia" w:hAnsiTheme="majorHAnsi" w:cstheme="majorBidi"/>
+      <w:rFonts w:ascii="Times New Roman" w:hAnsi="Times New Roman" w:eastAsia="Times New Roman" w:cs="Times New Roman"/>
       <w:color w:val="000000" w:themeColor="text1"/>
     </w:rPr>
     <w:tblPr>
@@ -6521,7 +6521,7 @@
       <w:spacing w:after="0" w:line="240" w:lineRule="auto"/>
     </w:pPr>
     <w:rPr>
-      <w:rFonts w:asciiTheme="majorHAnsi" w:eastAsiaTheme="majorEastAsia" w:hAnsiTheme="majorHAnsi" w:cstheme="majorBidi"/>
+      <w:rFonts w:ascii="Times New Roman" w:hAnsi="Times New Roman" w:eastAsia="Times New Roman" w:cs="Times New Roman"/>
       <w:color w:val="000000" w:themeColor="text1"/>
     </w:rPr>
     <w:tblPr>
@@ -6649,7 +6649,7 @@
       <w:spacing w:after="0" w:line="240" w:lineRule="auto"/>
     </w:pPr>
     <w:rPr>
-      <w:rFonts w:asciiTheme="majorHAnsi" w:eastAsiaTheme="majorEastAsia" w:hAnsiTheme="majorHAnsi" w:cstheme="majorBidi"/>
+      <w:rFonts w:ascii="Times New Roman" w:hAnsi="Times New Roman" w:eastAsia="Times New Roman" w:cs="Times New Roman"/>
       <w:color w:val="000000" w:themeColor="text1"/>
     </w:rPr>
     <w:tblPr>
@@ -6777,7 +6777,7 @@
       <w:spacing w:after="0" w:line="240" w:lineRule="auto"/>
     </w:pPr>
     <w:rPr>
-      <w:rFonts w:asciiTheme="majorHAnsi" w:eastAsiaTheme="majorEastAsia" w:hAnsiTheme="majorHAnsi" w:cstheme="majorBidi"/>
+      <w:rFonts w:ascii="Times New Roman" w:hAnsi="Times New Roman" w:eastAsia="Times New Roman" w:cs="Times New Roman"/>
       <w:color w:val="000000" w:themeColor="text1"/>
     </w:rPr>
     <w:tblPr>
@@ -7416,7 +7416,7 @@
       <w:spacing w:after="0" w:line="240" w:lineRule="auto"/>
     </w:pPr>
     <w:rPr>
-      <w:rFonts w:asciiTheme="majorHAnsi" w:eastAsiaTheme="majorEastAsia" w:hAnsiTheme="majorHAnsi" w:cstheme="majorBidi"/>
+      <w:rFonts w:ascii="Times New Roman" w:hAnsi="Times New Roman" w:eastAsia="Times New Roman" w:cs="Times New Roman"/>
       <w:color w:val="000000" w:themeColor="text1"/>
     </w:rPr>
     <w:tblPr>
@@ -7541,7 +7541,7 @@
       <w:spacing w:after="0" w:line="240" w:lineRule="auto"/>
     </w:pPr>
     <w:rPr>
-      <w:rFonts w:asciiTheme="majorHAnsi" w:eastAsiaTheme="majorEastAsia" w:hAnsiTheme="majorHAnsi" w:cstheme="majorBidi"/>
+      <w:rFonts w:ascii="Times New Roman" w:hAnsi="Times New Roman" w:eastAsia="Times New Roman" w:cs="Times New Roman"/>
       <w:color w:val="000000" w:themeColor="text1"/>
     </w:rPr>
     <w:tblPr>
@@ -7666,7 +7666,7 @@
       <w:spacing w:after="0" w:line="240" w:lineRule="auto"/>
     </w:pPr>
     <w:rPr>
-      <w:rFonts w:asciiTheme="majorHAnsi" w:eastAsiaTheme="majorEastAsia" w:hAnsiTheme="majorHAnsi" w:cstheme="majorBidi"/>
+      <w:rFonts w:ascii="Times New Roman" w:hAnsi="Times New Roman" w:eastAsia="Times New Roman" w:cs="Times New Roman"/>
       <w:color w:val="000000" w:themeColor="text1"/>
     </w:rPr>
     <w:tblPr>
@@ -7791,7 +7791,7 @@
       <w:spacing w:after="0" w:line="240" w:lineRule="auto"/>
     </w:pPr>
     <w:rPr>
-      <w:rFonts w:asciiTheme="majorHAnsi" w:eastAsiaTheme="majorEastAsia" w:hAnsiTheme="majorHAnsi" w:cstheme="majorBidi"/>
+      <w:rFonts w:ascii="Times New Roman" w:hAnsi="Times New Roman" w:eastAsia="Times New Roman" w:cs="Times New Roman"/>
       <w:color w:val="000000" w:themeColor="text1"/>
     </w:rPr>
     <w:tblPr>
@@ -7916,7 +7916,7 @@
       <w:spacing w:after="0" w:line="240" w:lineRule="auto"/>
     </w:pPr>
     <w:rPr>
-      <w:rFonts w:asciiTheme="majorHAnsi" w:eastAsiaTheme="majorEastAsia" w:hAnsiTheme="majorHAnsi" w:cstheme="majorBidi"/>
+      <w:rFonts w:ascii="Times New Roman" w:hAnsi="Times New Roman" w:eastAsia="Times New Roman" w:cs="Times New Roman"/>
       <w:color w:val="000000" w:themeColor="text1"/>
     </w:rPr>
     <w:tblPr>
@@ -8041,7 +8041,7 @@
       <w:spacing w:after="0" w:line="240" w:lineRule="auto"/>
     </w:pPr>
     <w:rPr>
-      <w:rFonts w:asciiTheme="majorHAnsi" w:eastAsiaTheme="majorEastAsia" w:hAnsiTheme="majorHAnsi" w:cstheme="majorBidi"/>
+      <w:rFonts w:ascii="Times New Roman" w:hAnsi="Times New Roman" w:eastAsia="Times New Roman" w:cs="Times New Roman"/>
       <w:color w:val="000000" w:themeColor="text1"/>
     </w:rPr>
     <w:tblPr>
@@ -8166,7 +8166,7 @@
       <w:spacing w:after="0" w:line="240" w:lineRule="auto"/>
     </w:pPr>
     <w:rPr>
-      <w:rFonts w:asciiTheme="majorHAnsi" w:eastAsiaTheme="majorEastAsia" w:hAnsiTheme="majorHAnsi" w:cstheme="majorBidi"/>
+      <w:rFonts w:ascii="Times New Roman" w:hAnsi="Times New Roman" w:eastAsia="Times New Roman" w:cs="Times New Roman"/>
       <w:color w:val="000000" w:themeColor="text1"/>
     </w:rPr>
     <w:tblPr>
@@ -12081,7 +12081,7 @@
   <w:docDefaults>
     <w:rPrDefault>
       <w:rPr>
-        <w:rFonts w:asciiTheme="minorHAnsi" w:eastAsiaTheme="minorEastAsia" w:hAnsiTheme="minorHAnsi" w:cstheme="minorBidi"/>
+        <w:rFonts w:ascii="Times New Roman" w:hAnsi="Times New Roman" w:eastAsia="Times New Roman" w:cs="Times New Roman"/>
         <w:sz w:val="22"/>
         <w:szCs w:val="22"/>
         <w:lang w:val="en-US" w:eastAsia="en-US" w:bidi="ar-SA"/>
@@ -12252,7 +12252,7 @@
       <w:outlineLvl w:val="0"/>
     </w:pPr>
     <w:rPr>
-      <w:rFonts w:asciiTheme="majorHAnsi" w:eastAsiaTheme="majorEastAsia" w:hAnsiTheme="majorHAnsi" w:cstheme="majorBidi"/>
+      <w:rFonts w:ascii="Times New Roman" w:hAnsi="Times New Roman" w:eastAsia="Times New Roman" w:cs="Times New Roman"/>
       <w:b/>
       <w:bCs/>
       <w:color w:val="365F91" w:themeColor="accent1" w:themeShade="BF"/>
@@ -12276,7 +12276,7 @@
       <w:outlineLvl w:val="1"/>
     </w:pPr>
     <w:rPr>
-      <w:rFonts w:asciiTheme="majorHAnsi" w:eastAsiaTheme="majorEastAsia" w:hAnsiTheme="majorHAnsi" w:cstheme="majorBidi"/>
+      <w:rFonts w:ascii="Times New Roman" w:hAnsi="Times New Roman" w:eastAsia="Times New Roman" w:cs="Times New Roman"/>
       <w:b/>
       <w:bCs/>
       <w:color w:val="4F81BD" w:themeColor="accent1"/>
@@ -12300,7 +12300,7 @@
       <w:outlineLvl w:val="2"/>
     </w:pPr>
     <w:rPr>
-      <w:rFonts w:asciiTheme="majorHAnsi" w:eastAsiaTheme="majorEastAsia" w:hAnsiTheme="majorHAnsi" w:cstheme="majorBidi"/>
+      <w:rFonts w:ascii="Times New Roman" w:hAnsi="Times New Roman" w:eastAsia="Times New Roman" w:cs="Times New Roman"/>
       <w:b/>
       <w:bCs/>
       <w:color w:val="4F81BD" w:themeColor="accent1"/>
@@ -12323,7 +12323,7 @@
       <w:outlineLvl w:val="3"/>
     </w:pPr>
     <w:rPr>
-      <w:rFonts w:asciiTheme="majorHAnsi" w:eastAsiaTheme="majorEastAsia" w:hAnsiTheme="majorHAnsi" w:cstheme="majorBidi"/>
+      <w:rFonts w:ascii="Times New Roman" w:hAnsi="Times New Roman" w:eastAsia="Times New Roman" w:cs="Times New Roman"/>
       <w:b/>
       <w:bCs/>
       <w:i/>
@@ -12348,7 +12348,7 @@
       <w:outlineLvl w:val="4"/>
     </w:pPr>
     <w:rPr>
-      <w:rFonts w:asciiTheme="majorHAnsi" w:eastAsiaTheme="majorEastAsia" w:hAnsiTheme="majorHAnsi" w:cstheme="majorBidi"/>
+      <w:rFonts w:ascii="Times New Roman" w:hAnsi="Times New Roman" w:eastAsia="Times New Roman" w:cs="Times New Roman"/>
       <w:color w:val="243F60" w:themeColor="accent1" w:themeShade="7F"/>
     </w:rPr>
   </w:style>
@@ -12369,7 +12369,7 @@
       <w:outlineLvl w:val="5"/>
     </w:pPr>
     <w:rPr>
-      <w:rFonts w:asciiTheme="majorHAnsi" w:eastAsiaTheme="majorEastAsia" w:hAnsiTheme="majorHAnsi" w:cstheme="majorBidi"/>
+      <w:rFonts w:ascii="Times New Roman" w:hAnsi="Times New Roman" w:eastAsia="Times New Roman" w:cs="Times New Roman"/>
       <w:i/>
       <w:iCs/>
       <w:color w:val="243F60" w:themeColor="accent1" w:themeShade="7F"/>
@@ -12392,7 +12392,7 @@
       <w:outlineLvl w:val="6"/>
     </w:pPr>
     <w:rPr>
-      <w:rFonts w:asciiTheme="majorHAnsi" w:eastAsiaTheme="majorEastAsia" w:hAnsiTheme="majorHAnsi" w:cstheme="majorBidi"/>
+      <w:rFonts w:ascii="Times New Roman" w:hAnsi="Times New Roman" w:eastAsia="Times New Roman" w:cs="Times New Roman"/>
       <w:i/>
       <w:iCs/>
       <w:color w:val="404040" w:themeColor="text1" w:themeTint="BF"/>
@@ -12415,7 +12415,7 @@
       <w:outlineLvl w:val="7"/>
     </w:pPr>
     <w:rPr>
-      <w:rFonts w:asciiTheme="majorHAnsi" w:eastAsiaTheme="majorEastAsia" w:hAnsiTheme="majorHAnsi" w:cstheme="majorBidi"/>
+      <w:rFonts w:ascii="Times New Roman" w:hAnsi="Times New Roman" w:eastAsia="Times New Roman" w:cs="Times New Roman"/>
       <w:color w:val="4F81BD" w:themeColor="accent1"/>
       <w:sz w:val="20"/>
       <w:szCs w:val="20"/>
@@ -12438,7 +12438,7 @@
       <w:outlineLvl w:val="8"/>
     </w:pPr>
     <w:rPr>
-      <w:rFonts w:asciiTheme="majorHAnsi" w:eastAsiaTheme="majorEastAsia" w:hAnsiTheme="majorHAnsi" w:cstheme="majorBidi"/>
+      <w:rFonts w:ascii="Times New Roman" w:hAnsi="Times New Roman" w:eastAsia="Times New Roman" w:cs="Times New Roman"/>
       <w:i/>
       <w:iCs/>
       <w:color w:val="404040" w:themeColor="text1" w:themeTint="BF"/>
@@ -12489,7 +12489,7 @@
     <w:uiPriority w:val="9"/>
     <w:rsid w:val="00FC693F"/>
     <w:rPr>
-      <w:rFonts w:asciiTheme="majorHAnsi" w:eastAsiaTheme="majorEastAsia" w:hAnsiTheme="majorHAnsi" w:cstheme="majorBidi"/>
+      <w:rFonts w:ascii="Times New Roman" w:hAnsi="Times New Roman" w:eastAsia="Times New Roman" w:cs="Times New Roman"/>
       <w:b/>
       <w:bCs/>
       <w:color w:val="365F91" w:themeColor="accent1" w:themeShade="BF"/>
@@ -12504,7 +12504,7 @@
     <w:uiPriority w:val="9"/>
     <w:rsid w:val="00FC693F"/>
     <w:rPr>
-      <w:rFonts w:asciiTheme="majorHAnsi" w:eastAsiaTheme="majorEastAsia" w:hAnsiTheme="majorHAnsi" w:cstheme="majorBidi"/>
+      <w:rFonts w:ascii="Times New Roman" w:hAnsi="Times New Roman" w:eastAsia="Times New Roman" w:cs="Times New Roman"/>
       <w:b/>
       <w:bCs/>
       <w:color w:val="4F81BD" w:themeColor="accent1"/>
@@ -12519,7 +12519,7 @@
     <w:uiPriority w:val="9"/>
     <w:rsid w:val="00FC693F"/>
     <w:rPr>
-      <w:rFonts w:asciiTheme="majorHAnsi" w:eastAsiaTheme="majorEastAsia" w:hAnsiTheme="majorHAnsi" w:cstheme="majorBidi"/>
+      <w:rFonts w:ascii="Times New Roman" w:hAnsi="Times New Roman" w:eastAsia="Times New Roman" w:cs="Times New Roman"/>
       <w:b/>
       <w:bCs/>
       <w:color w:val="4F81BD" w:themeColor="accent1"/>
@@ -12541,7 +12541,7 @@
       <w:contextualSpacing/>
     </w:pPr>
     <w:rPr>
-      <w:rFonts w:asciiTheme="majorHAnsi" w:eastAsiaTheme="majorEastAsia" w:hAnsiTheme="majorHAnsi" w:cstheme="majorBidi"/>
+      <w:rFonts w:ascii="Times New Roman" w:hAnsi="Times New Roman" w:eastAsia="Times New Roman" w:cs="Times New Roman"/>
       <w:color w:val="17365D" w:themeColor="text2" w:themeShade="BF"/>
       <w:spacing w:val="5"/>
       <w:kern w:val="28"/>
@@ -12556,7 +12556,7 @@
     <w:uiPriority w:val="10"/>
     <w:rsid w:val="00FC693F"/>
     <w:rPr>
-      <w:rFonts w:asciiTheme="majorHAnsi" w:eastAsiaTheme="majorEastAsia" w:hAnsiTheme="majorHAnsi" w:cstheme="majorBidi"/>
+      <w:rFonts w:ascii="Times New Roman" w:hAnsi="Times New Roman" w:eastAsia="Times New Roman" w:cs="Times New Roman"/>
       <w:color w:val="17365D" w:themeColor="text2" w:themeShade="BF"/>
       <w:spacing w:val="5"/>
       <w:kern w:val="28"/>
@@ -12578,7 +12578,7 @@
       </w:numPr>
     </w:pPr>
     <w:rPr>
-      <w:rFonts w:asciiTheme="majorHAnsi" w:eastAsiaTheme="majorEastAsia" w:hAnsiTheme="majorHAnsi" w:cstheme="majorBidi"/>
+      <w:rFonts w:ascii="Times New Roman" w:hAnsi="Times New Roman" w:eastAsia="Times New Roman" w:cs="Times New Roman"/>
       <w:i/>
       <w:iCs/>
       <w:color w:val="4F81BD" w:themeColor="accent1"/>
@@ -12594,7 +12594,7 @@
     <w:uiPriority w:val="11"/>
     <w:rsid w:val="00FC693F"/>
     <w:rPr>
-      <w:rFonts w:asciiTheme="majorHAnsi" w:eastAsiaTheme="majorEastAsia" w:hAnsiTheme="majorHAnsi" w:cstheme="majorBidi"/>
+      <w:rFonts w:ascii="Times New Roman" w:hAnsi="Times New Roman" w:eastAsia="Times New Roman" w:cs="Times New Roman"/>
       <w:i/>
       <w:iCs/>
       <w:color w:val="4F81BD" w:themeColor="accent1"/>
@@ -12841,7 +12841,7 @@
       </w:tabs>
     </w:pPr>
     <w:rPr>
-      <w:rFonts w:ascii="Courier" w:hAnsi="Courier"/>
+      <w:rFonts w:ascii="Times New Roman" w:hAnsi="Times New Roman" w:eastAsia="Times New Roman" w:cs="Times New Roman"/>
       <w:sz w:val="20"/>
       <w:szCs w:val="20"/>
     </w:rPr>
@@ -12853,7 +12853,7 @@
     <w:uiPriority w:val="99"/>
     <w:rsid w:val="0029639D"/>
     <w:rPr>
-      <w:rFonts w:ascii="Courier" w:hAnsi="Courier"/>
+      <w:rFonts w:ascii="Times New Roman" w:hAnsi="Times New Roman" w:eastAsia="Times New Roman" w:cs="Times New Roman"/>
       <w:sz w:val="20"/>
       <w:szCs w:val="20"/>
     </w:rPr>
@@ -12892,7 +12892,7 @@
     <w:semiHidden/>
     <w:rsid w:val="00FC693F"/>
     <w:rPr>
-      <w:rFonts w:asciiTheme="majorHAnsi" w:eastAsiaTheme="majorEastAsia" w:hAnsiTheme="majorHAnsi" w:cstheme="majorBidi"/>
+      <w:rFonts w:ascii="Times New Roman" w:hAnsi="Times New Roman" w:eastAsia="Times New Roman" w:cs="Times New Roman"/>
       <w:b/>
       <w:bCs/>
       <w:i/>
@@ -12908,7 +12908,7 @@
     <w:semiHidden/>
     <w:rsid w:val="00FC693F"/>
     <w:rPr>
-      <w:rFonts w:asciiTheme="majorHAnsi" w:eastAsiaTheme="majorEastAsia" w:hAnsiTheme="majorHAnsi" w:cstheme="majorBidi"/>
+      <w:rFonts w:ascii="Times New Roman" w:hAnsi="Times New Roman" w:eastAsia="Times New Roman" w:cs="Times New Roman"/>
       <w:color w:val="243F60" w:themeColor="accent1" w:themeShade="7F"/>
     </w:rPr>
   </w:style>
@@ -12920,7 +12920,7 @@
     <w:semiHidden/>
     <w:rsid w:val="00FC693F"/>
     <w:rPr>
-      <w:rFonts w:asciiTheme="majorHAnsi" w:eastAsiaTheme="majorEastAsia" w:hAnsiTheme="majorHAnsi" w:cstheme="majorBidi"/>
+      <w:rFonts w:ascii="Times New Roman" w:hAnsi="Times New Roman" w:eastAsia="Times New Roman" w:cs="Times New Roman"/>
       <w:i/>
       <w:iCs/>
       <w:color w:val="243F60" w:themeColor="accent1" w:themeShade="7F"/>
@@ -12934,7 +12934,7 @@
     <w:semiHidden/>
     <w:rsid w:val="00FC693F"/>
     <w:rPr>
-      <w:rFonts w:asciiTheme="majorHAnsi" w:eastAsiaTheme="majorEastAsia" w:hAnsiTheme="majorHAnsi" w:cstheme="majorBidi"/>
+      <w:rFonts w:ascii="Times New Roman" w:hAnsi="Times New Roman" w:eastAsia="Times New Roman" w:cs="Times New Roman"/>
       <w:i/>
       <w:iCs/>
       <w:color w:val="404040" w:themeColor="text1" w:themeTint="BF"/>
@@ -12948,7 +12948,7 @@
     <w:semiHidden/>
     <w:rsid w:val="00FC693F"/>
     <w:rPr>
-      <w:rFonts w:asciiTheme="majorHAnsi" w:eastAsiaTheme="majorEastAsia" w:hAnsiTheme="majorHAnsi" w:cstheme="majorBidi"/>
+      <w:rFonts w:ascii="Times New Roman" w:hAnsi="Times New Roman" w:eastAsia="Times New Roman" w:cs="Times New Roman"/>
       <w:color w:val="4F81BD" w:themeColor="accent1"/>
       <w:sz w:val="20"/>
       <w:szCs w:val="20"/>
@@ -12962,7 +12962,7 @@
     <w:semiHidden/>
     <w:rsid w:val="00FC693F"/>
     <w:rPr>
-      <w:rFonts w:asciiTheme="majorHAnsi" w:eastAsiaTheme="majorEastAsia" w:hAnsiTheme="majorHAnsi" w:cstheme="majorBidi"/>
+      <w:rFonts w:ascii="Times New Roman" w:hAnsi="Times New Roman" w:eastAsia="Times New Roman" w:cs="Times New Roman"/>
       <w:i/>
       <w:iCs/>
       <w:color w:val="404040" w:themeColor="text1" w:themeTint="BF"/>
@@ -14551,7 +14551,7 @@
         <w:spacing w:before="0" w:after="0" w:line="240" w:lineRule="auto"/>
       </w:pPr>
       <w:rPr>
-        <w:rFonts w:asciiTheme="majorHAnsi" w:eastAsiaTheme="majorEastAsia" w:hAnsiTheme="majorHAnsi" w:cstheme="majorBidi"/>
+        <w:rFonts w:ascii="Times New Roman" w:hAnsi="Times New Roman" w:eastAsia="Times New Roman" w:cs="Times New Roman"/>
         <w:b/>
         <w:bCs/>
       </w:rPr>
@@ -14572,7 +14572,7 @@
         <w:spacing w:before="0" w:after="0" w:line="240" w:lineRule="auto"/>
       </w:pPr>
       <w:rPr>
-        <w:rFonts w:asciiTheme="majorHAnsi" w:eastAsiaTheme="majorEastAsia" w:hAnsiTheme="majorHAnsi" w:cstheme="majorBidi"/>
+        <w:rFonts w:ascii="Times New Roman" w:hAnsi="Times New Roman" w:eastAsia="Times New Roman" w:cs="Times New Roman"/>
         <w:b/>
         <w:bCs/>
       </w:rPr>
@@ -14590,14 +14590,14 @@
     </w:tblStylePr>
     <w:tblStylePr w:type="firstCol">
       <w:rPr>
-        <w:rFonts w:asciiTheme="majorHAnsi" w:eastAsiaTheme="majorEastAsia" w:hAnsiTheme="majorHAnsi" w:cstheme="majorBidi"/>
+        <w:rFonts w:ascii="Times New Roman" w:hAnsi="Times New Roman" w:eastAsia="Times New Roman" w:cs="Times New Roman"/>
         <w:b/>
         <w:bCs/>
       </w:rPr>
     </w:tblStylePr>
     <w:tblStylePr w:type="lastCol">
       <w:rPr>
-        <w:rFonts w:asciiTheme="majorHAnsi" w:eastAsiaTheme="majorEastAsia" w:hAnsiTheme="majorHAnsi" w:cstheme="majorBidi"/>
+        <w:rFonts w:ascii="Times New Roman" w:hAnsi="Times New Roman" w:eastAsia="Times New Roman" w:cs="Times New Roman"/>
         <w:b/>
         <w:bCs/>
       </w:rPr>
@@ -14681,7 +14681,7 @@
         <w:spacing w:before="0" w:after="0" w:line="240" w:lineRule="auto"/>
       </w:pPr>
       <w:rPr>
-        <w:rFonts w:asciiTheme="majorHAnsi" w:eastAsiaTheme="majorEastAsia" w:hAnsiTheme="majorHAnsi" w:cstheme="majorBidi"/>
+        <w:rFonts w:ascii="Times New Roman" w:hAnsi="Times New Roman" w:eastAsia="Times New Roman" w:cs="Times New Roman"/>
         <w:b/>
         <w:bCs/>
       </w:rPr>
@@ -14702,7 +14702,7 @@
         <w:spacing w:before="0" w:after="0" w:line="240" w:lineRule="auto"/>
       </w:pPr>
       <w:rPr>
-        <w:rFonts w:asciiTheme="majorHAnsi" w:eastAsiaTheme="majorEastAsia" w:hAnsiTheme="majorHAnsi" w:cstheme="majorBidi"/>
+        <w:rFonts w:ascii="Times New Roman" w:hAnsi="Times New Roman" w:eastAsia="Times New Roman" w:cs="Times New Roman"/>
         <w:b/>
         <w:bCs/>
       </w:rPr>
@@ -14720,14 +14720,14 @@
     </w:tblStylePr>
     <w:tblStylePr w:type="firstCol">
       <w:rPr>
-        <w:rFonts w:asciiTheme="majorHAnsi" w:eastAsiaTheme="majorEastAsia" w:hAnsiTheme="majorHAnsi" w:cstheme="majorBidi"/>
+        <w:rFonts w:ascii="Times New Roman" w:hAnsi="Times New Roman" w:eastAsia="Times New Roman" w:cs="Times New Roman"/>
         <w:b/>
         <w:bCs/>
       </w:rPr>
     </w:tblStylePr>
     <w:tblStylePr w:type="lastCol">
       <w:rPr>
-        <w:rFonts w:asciiTheme="majorHAnsi" w:eastAsiaTheme="majorEastAsia" w:hAnsiTheme="majorHAnsi" w:cstheme="majorBidi"/>
+        <w:rFonts w:ascii="Times New Roman" w:hAnsi="Times New Roman" w:eastAsia="Times New Roman" w:cs="Times New Roman"/>
         <w:b/>
         <w:bCs/>
       </w:rPr>
@@ -14811,7 +14811,7 @@
         <w:spacing w:before="0" w:after="0" w:line="240" w:lineRule="auto"/>
       </w:pPr>
       <w:rPr>
-        <w:rFonts w:asciiTheme="majorHAnsi" w:eastAsiaTheme="majorEastAsia" w:hAnsiTheme="majorHAnsi" w:cstheme="majorBidi"/>
+        <w:rFonts w:ascii="Times New Roman" w:hAnsi="Times New Roman" w:eastAsia="Times New Roman" w:cs="Times New Roman"/>
         <w:b/>
         <w:bCs/>
       </w:rPr>
@@ -14832,7 +14832,7 @@
         <w:spacing w:before="0" w:after="0" w:line="240" w:lineRule="auto"/>
       </w:pPr>
       <w:rPr>
-        <w:rFonts w:asciiTheme="majorHAnsi" w:eastAsiaTheme="majorEastAsia" w:hAnsiTheme="majorHAnsi" w:cstheme="majorBidi"/>
+        <w:rFonts w:ascii="Times New Roman" w:hAnsi="Times New Roman" w:eastAsia="Times New Roman" w:cs="Times New Roman"/>
         <w:b/>
         <w:bCs/>
       </w:rPr>
@@ -14850,14 +14850,14 @@
     </w:tblStylePr>
     <w:tblStylePr w:type="firstCol">
       <w:rPr>
-        <w:rFonts w:asciiTheme="majorHAnsi" w:eastAsiaTheme="majorEastAsia" w:hAnsiTheme="majorHAnsi" w:cstheme="majorBidi"/>
+        <w:rFonts w:ascii="Times New Roman" w:hAnsi="Times New Roman" w:eastAsia="Times New Roman" w:cs="Times New Roman"/>
         <w:b/>
         <w:bCs/>
       </w:rPr>
     </w:tblStylePr>
     <w:tblStylePr w:type="lastCol">
       <w:rPr>
-        <w:rFonts w:asciiTheme="majorHAnsi" w:eastAsiaTheme="majorEastAsia" w:hAnsiTheme="majorHAnsi" w:cstheme="majorBidi"/>
+        <w:rFonts w:ascii="Times New Roman" w:hAnsi="Times New Roman" w:eastAsia="Times New Roman" w:cs="Times New Roman"/>
         <w:b/>
         <w:bCs/>
       </w:rPr>
@@ -14941,7 +14941,7 @@
         <w:spacing w:before="0" w:after="0" w:line="240" w:lineRule="auto"/>
       </w:pPr>
       <w:rPr>
-        <w:rFonts w:asciiTheme="majorHAnsi" w:eastAsiaTheme="majorEastAsia" w:hAnsiTheme="majorHAnsi" w:cstheme="majorBidi"/>
+        <w:rFonts w:ascii="Times New Roman" w:hAnsi="Times New Roman" w:eastAsia="Times New Roman" w:cs="Times New Roman"/>
         <w:b/>
         <w:bCs/>
       </w:rPr>
@@ -14962,7 +14962,7 @@
         <w:spacing w:before="0" w:after="0" w:line="240" w:lineRule="auto"/>
       </w:pPr>
       <w:rPr>
-        <w:rFonts w:asciiTheme="majorHAnsi" w:eastAsiaTheme="majorEastAsia" w:hAnsiTheme="majorHAnsi" w:cstheme="majorBidi"/>
+        <w:rFonts w:ascii="Times New Roman" w:hAnsi="Times New Roman" w:eastAsia="Times New Roman" w:cs="Times New Roman"/>
         <w:b/>
         <w:bCs/>
       </w:rPr>
@@ -14980,14 +14980,14 @@
     </w:tblStylePr>
     <w:tblStylePr w:type="firstCol">
       <w:rPr>
-        <w:rFonts w:asciiTheme="majorHAnsi" w:eastAsiaTheme="majorEastAsia" w:hAnsiTheme="majorHAnsi" w:cstheme="majorBidi"/>
+        <w:rFonts w:ascii="Times New Roman" w:hAnsi="Times New Roman" w:eastAsia="Times New Roman" w:cs="Times New Roman"/>
         <w:b/>
         <w:bCs/>
       </w:rPr>
     </w:tblStylePr>
     <w:tblStylePr w:type="lastCol">
       <w:rPr>
-        <w:rFonts w:asciiTheme="majorHAnsi" w:eastAsiaTheme="majorEastAsia" w:hAnsiTheme="majorHAnsi" w:cstheme="majorBidi"/>
+        <w:rFonts w:ascii="Times New Roman" w:hAnsi="Times New Roman" w:eastAsia="Times New Roman" w:cs="Times New Roman"/>
         <w:b/>
         <w:bCs/>
       </w:rPr>
@@ -15071,7 +15071,7 @@
         <w:spacing w:before="0" w:after="0" w:line="240" w:lineRule="auto"/>
       </w:pPr>
       <w:rPr>
-        <w:rFonts w:asciiTheme="majorHAnsi" w:eastAsiaTheme="majorEastAsia" w:hAnsiTheme="majorHAnsi" w:cstheme="majorBidi"/>
+        <w:rFonts w:ascii="Times New Roman" w:hAnsi="Times New Roman" w:eastAsia="Times New Roman" w:cs="Times New Roman"/>
         <w:b/>
         <w:bCs/>
       </w:rPr>
@@ -15092,7 +15092,7 @@
         <w:spacing w:before="0" w:after="0" w:line="240" w:lineRule="auto"/>
       </w:pPr>
       <w:rPr>
-        <w:rFonts w:asciiTheme="majorHAnsi" w:eastAsiaTheme="majorEastAsia" w:hAnsiTheme="majorHAnsi" w:cstheme="majorBidi"/>
+        <w:rFonts w:ascii="Times New Roman" w:hAnsi="Times New Roman" w:eastAsia="Times New Roman" w:cs="Times New Roman"/>
         <w:b/>
         <w:bCs/>
       </w:rPr>
@@ -15110,14 +15110,14 @@
     </w:tblStylePr>
     <w:tblStylePr w:type="firstCol">
       <w:rPr>
-        <w:rFonts w:asciiTheme="majorHAnsi" w:eastAsiaTheme="majorEastAsia" w:hAnsiTheme="majorHAnsi" w:cstheme="majorBidi"/>
+        <w:rFonts w:ascii="Times New Roman" w:hAnsi="Times New Roman" w:eastAsia="Times New Roman" w:cs="Times New Roman"/>
         <w:b/>
         <w:bCs/>
       </w:rPr>
     </w:tblStylePr>
     <w:tblStylePr w:type="lastCol">
       <w:rPr>
-        <w:rFonts w:asciiTheme="majorHAnsi" w:eastAsiaTheme="majorEastAsia" w:hAnsiTheme="majorHAnsi" w:cstheme="majorBidi"/>
+        <w:rFonts w:ascii="Times New Roman" w:hAnsi="Times New Roman" w:eastAsia="Times New Roman" w:cs="Times New Roman"/>
         <w:b/>
         <w:bCs/>
       </w:rPr>
@@ -15201,7 +15201,7 @@
         <w:spacing w:before="0" w:after="0" w:line="240" w:lineRule="auto"/>
       </w:pPr>
       <w:rPr>
-        <w:rFonts w:asciiTheme="majorHAnsi" w:eastAsiaTheme="majorEastAsia" w:hAnsiTheme="majorHAnsi" w:cstheme="majorBidi"/>
+        <w:rFonts w:ascii="Times New Roman" w:hAnsi="Times New Roman" w:eastAsia="Times New Roman" w:cs="Times New Roman"/>
         <w:b/>
         <w:bCs/>
       </w:rPr>
@@ -15222,7 +15222,7 @@
         <w:spacing w:before="0" w:after="0" w:line="240" w:lineRule="auto"/>
       </w:pPr>
       <w:rPr>
-        <w:rFonts w:asciiTheme="majorHAnsi" w:eastAsiaTheme="majorEastAsia" w:hAnsiTheme="majorHAnsi" w:cstheme="majorBidi"/>
+        <w:rFonts w:ascii="Times New Roman" w:hAnsi="Times New Roman" w:eastAsia="Times New Roman" w:cs="Times New Roman"/>
         <w:b/>
         <w:bCs/>
       </w:rPr>
@@ -15240,14 +15240,14 @@
     </w:tblStylePr>
     <w:tblStylePr w:type="firstCol">
       <w:rPr>
-        <w:rFonts w:asciiTheme="majorHAnsi" w:eastAsiaTheme="majorEastAsia" w:hAnsiTheme="majorHAnsi" w:cstheme="majorBidi"/>
+        <w:rFonts w:ascii="Times New Roman" w:hAnsi="Times New Roman" w:eastAsia="Times New Roman" w:cs="Times New Roman"/>
         <w:b/>
         <w:bCs/>
       </w:rPr>
     </w:tblStylePr>
     <w:tblStylePr w:type="lastCol">
       <w:rPr>
-        <w:rFonts w:asciiTheme="majorHAnsi" w:eastAsiaTheme="majorEastAsia" w:hAnsiTheme="majorHAnsi" w:cstheme="majorBidi"/>
+        <w:rFonts w:ascii="Times New Roman" w:hAnsi="Times New Roman" w:eastAsia="Times New Roman" w:cs="Times New Roman"/>
         <w:b/>
         <w:bCs/>
       </w:rPr>
@@ -15331,7 +15331,7 @@
         <w:spacing w:before="0" w:after="0" w:line="240" w:lineRule="auto"/>
       </w:pPr>
       <w:rPr>
-        <w:rFonts w:asciiTheme="majorHAnsi" w:eastAsiaTheme="majorEastAsia" w:hAnsiTheme="majorHAnsi" w:cstheme="majorBidi"/>
+        <w:rFonts w:ascii="Times New Roman" w:hAnsi="Times New Roman" w:eastAsia="Times New Roman" w:cs="Times New Roman"/>
         <w:b/>
         <w:bCs/>
       </w:rPr>
@@ -15352,7 +15352,7 @@
         <w:spacing w:before="0" w:after="0" w:line="240" w:lineRule="auto"/>
       </w:pPr>
       <w:rPr>
-        <w:rFonts w:asciiTheme="majorHAnsi" w:eastAsiaTheme="majorEastAsia" w:hAnsiTheme="majorHAnsi" w:cstheme="majorBidi"/>
+        <w:rFonts w:ascii="Times New Roman" w:hAnsi="Times New Roman" w:eastAsia="Times New Roman" w:cs="Times New Roman"/>
         <w:b/>
         <w:bCs/>
       </w:rPr>
@@ -15370,14 +15370,14 @@
     </w:tblStylePr>
     <w:tblStylePr w:type="firstCol">
       <w:rPr>
-        <w:rFonts w:asciiTheme="majorHAnsi" w:eastAsiaTheme="majorEastAsia" w:hAnsiTheme="majorHAnsi" w:cstheme="majorBidi"/>
+        <w:rFonts w:ascii="Times New Roman" w:hAnsi="Times New Roman" w:eastAsia="Times New Roman" w:cs="Times New Roman"/>
         <w:b/>
         <w:bCs/>
       </w:rPr>
     </w:tblStylePr>
     <w:tblStylePr w:type="lastCol">
       <w:rPr>
-        <w:rFonts w:asciiTheme="majorHAnsi" w:eastAsiaTheme="majorEastAsia" w:hAnsiTheme="majorHAnsi" w:cstheme="majorBidi"/>
+        <w:rFonts w:ascii="Times New Roman" w:hAnsi="Times New Roman" w:eastAsia="Times New Roman" w:cs="Times New Roman"/>
         <w:b/>
         <w:bCs/>
       </w:rPr>
@@ -17242,7 +17242,7 @@
     </w:tblPr>
     <w:tblStylePr w:type="firstRow">
       <w:rPr>
-        <w:rFonts w:asciiTheme="majorHAnsi" w:eastAsiaTheme="majorEastAsia" w:hAnsiTheme="majorHAnsi" w:cstheme="majorBidi"/>
+        <w:rFonts w:ascii="Times New Roman" w:hAnsi="Times New Roman" w:eastAsia="Times New Roman" w:cs="Times New Roman"/>
       </w:rPr>
       <w:tblPr/>
       <w:tcPr>
@@ -17326,7 +17326,7 @@
     </w:tblPr>
     <w:tblStylePr w:type="firstRow">
       <w:rPr>
-        <w:rFonts w:asciiTheme="majorHAnsi" w:eastAsiaTheme="majorEastAsia" w:hAnsiTheme="majorHAnsi" w:cstheme="majorBidi"/>
+        <w:rFonts w:ascii="Times New Roman" w:hAnsi="Times New Roman" w:eastAsia="Times New Roman" w:cs="Times New Roman"/>
       </w:rPr>
       <w:tblPr/>
       <w:tcPr>
@@ -17410,7 +17410,7 @@
     </w:tblPr>
     <w:tblStylePr w:type="firstRow">
       <w:rPr>
-        <w:rFonts w:asciiTheme="majorHAnsi" w:eastAsiaTheme="majorEastAsia" w:hAnsiTheme="majorHAnsi" w:cstheme="majorBidi"/>
+        <w:rFonts w:ascii="Times New Roman" w:hAnsi="Times New Roman" w:eastAsia="Times New Roman" w:cs="Times New Roman"/>
       </w:rPr>
       <w:tblPr/>
       <w:tcPr>
@@ -17494,7 +17494,7 @@
     </w:tblPr>
     <w:tblStylePr w:type="firstRow">
       <w:rPr>
-        <w:rFonts w:asciiTheme="majorHAnsi" w:eastAsiaTheme="majorEastAsia" w:hAnsiTheme="majorHAnsi" w:cstheme="majorBidi"/>
+        <w:rFonts w:ascii="Times New Roman" w:hAnsi="Times New Roman" w:eastAsia="Times New Roman" w:cs="Times New Roman"/>
       </w:rPr>
       <w:tblPr/>
       <w:tcPr>
@@ -17578,7 +17578,7 @@
     </w:tblPr>
     <w:tblStylePr w:type="firstRow">
       <w:rPr>
-        <w:rFonts w:asciiTheme="majorHAnsi" w:eastAsiaTheme="majorEastAsia" w:hAnsiTheme="majorHAnsi" w:cstheme="majorBidi"/>
+        <w:rFonts w:ascii="Times New Roman" w:hAnsi="Times New Roman" w:eastAsia="Times New Roman" w:cs="Times New Roman"/>
       </w:rPr>
       <w:tblPr/>
       <w:tcPr>
@@ -17662,7 +17662,7 @@
     </w:tblPr>
     <w:tblStylePr w:type="firstRow">
       <w:rPr>
-        <w:rFonts w:asciiTheme="majorHAnsi" w:eastAsiaTheme="majorEastAsia" w:hAnsiTheme="majorHAnsi" w:cstheme="majorBidi"/>
+        <w:rFonts w:ascii="Times New Roman" w:hAnsi="Times New Roman" w:eastAsia="Times New Roman" w:cs="Times New Roman"/>
       </w:rPr>
       <w:tblPr/>
       <w:tcPr>
@@ -17746,7 +17746,7 @@
     </w:tblPr>
     <w:tblStylePr w:type="firstRow">
       <w:rPr>
-        <w:rFonts w:asciiTheme="majorHAnsi" w:eastAsiaTheme="majorEastAsia" w:hAnsiTheme="majorHAnsi" w:cstheme="majorBidi"/>
+        <w:rFonts w:ascii="Times New Roman" w:hAnsi="Times New Roman" w:eastAsia="Times New Roman" w:cs="Times New Roman"/>
       </w:rPr>
       <w:tblPr/>
       <w:tcPr>
@@ -17811,7 +17811,7 @@
       <w:spacing w:after="0" w:line="240" w:lineRule="auto"/>
     </w:pPr>
     <w:rPr>
-      <w:rFonts w:asciiTheme="majorHAnsi" w:eastAsiaTheme="majorEastAsia" w:hAnsiTheme="majorHAnsi" w:cstheme="majorBidi"/>
+      <w:rFonts w:ascii="Times New Roman" w:hAnsi="Times New Roman" w:eastAsia="Times New Roman" w:cs="Times New Roman"/>
       <w:color w:val="000000" w:themeColor="text1"/>
     </w:rPr>
     <w:tblPr>
@@ -17939,7 +17939,7 @@
       <w:spacing w:after="0" w:line="240" w:lineRule="auto"/>
     </w:pPr>
     <w:rPr>
-      <w:rFonts w:asciiTheme="majorHAnsi" w:eastAsiaTheme="majorEastAsia" w:hAnsiTheme="majorHAnsi" w:cstheme="majorBidi"/>
+      <w:rFonts w:ascii="Times New Roman" w:hAnsi="Times New Roman" w:eastAsia="Times New Roman" w:cs="Times New Roman"/>
       <w:color w:val="000000" w:themeColor="text1"/>
     </w:rPr>
     <w:tblPr>
@@ -18067,7 +18067,7 @@
       <w:spacing w:after="0" w:line="240" w:lineRule="auto"/>
     </w:pPr>
     <w:rPr>
-      <w:rFonts w:asciiTheme="majorHAnsi" w:eastAsiaTheme="majorEastAsia" w:hAnsiTheme="majorHAnsi" w:cstheme="majorBidi"/>
+      <w:rFonts w:ascii="Times New Roman" w:hAnsi="Times New Roman" w:eastAsia="Times New Roman" w:cs="Times New Roman"/>
       <w:color w:val="000000" w:themeColor="text1"/>
     </w:rPr>
     <w:tblPr>
@@ -18195,7 +18195,7 @@
       <w:spacing w:after="0" w:line="240" w:lineRule="auto"/>
     </w:pPr>
     <w:rPr>
-      <w:rFonts w:asciiTheme="majorHAnsi" w:eastAsiaTheme="majorEastAsia" w:hAnsiTheme="majorHAnsi" w:cstheme="majorBidi"/>
+      <w:rFonts w:ascii="Times New Roman" w:hAnsi="Times New Roman" w:eastAsia="Times New Roman" w:cs="Times New Roman"/>
       <w:color w:val="000000" w:themeColor="text1"/>
     </w:rPr>
     <w:tblPr>
@@ -18323,7 +18323,7 @@
       <w:spacing w:after="0" w:line="240" w:lineRule="auto"/>
     </w:pPr>
     <w:rPr>
-      <w:rFonts w:asciiTheme="majorHAnsi" w:eastAsiaTheme="majorEastAsia" w:hAnsiTheme="majorHAnsi" w:cstheme="majorBidi"/>
+      <w:rFonts w:ascii="Times New Roman" w:hAnsi="Times New Roman" w:eastAsia="Times New Roman" w:cs="Times New Roman"/>
       <w:color w:val="000000" w:themeColor="text1"/>
     </w:rPr>
     <w:tblPr>
@@ -18451,7 +18451,7 @@
       <w:spacing w:after="0" w:line="240" w:lineRule="auto"/>
     </w:pPr>
     <w:rPr>
-      <w:rFonts w:asciiTheme="majorHAnsi" w:eastAsiaTheme="majorEastAsia" w:hAnsiTheme="majorHAnsi" w:cstheme="majorBidi"/>
+      <w:rFonts w:ascii="Times New Roman" w:hAnsi="Times New Roman" w:eastAsia="Times New Roman" w:cs="Times New Roman"/>
       <w:color w:val="000000" w:themeColor="text1"/>
     </w:rPr>
     <w:tblPr>
@@ -18579,7 +18579,7 @@
       <w:spacing w:after="0" w:line="240" w:lineRule="auto"/>
     </w:pPr>
     <w:rPr>
-      <w:rFonts w:asciiTheme="majorHAnsi" w:eastAsiaTheme="majorEastAsia" w:hAnsiTheme="majorHAnsi" w:cstheme="majorBidi"/>
+      <w:rFonts w:ascii="Times New Roman" w:hAnsi="Times New Roman" w:eastAsia="Times New Roman" w:cs="Times New Roman"/>
       <w:color w:val="000000" w:themeColor="text1"/>
     </w:rPr>
     <w:tblPr>
@@ -19218,7 +19218,7 @@
       <w:spacing w:after="0" w:line="240" w:lineRule="auto"/>
     </w:pPr>
     <w:rPr>
-      <w:rFonts w:asciiTheme="majorHAnsi" w:eastAsiaTheme="majorEastAsia" w:hAnsiTheme="majorHAnsi" w:cstheme="majorBidi"/>
+      <w:rFonts w:ascii="Times New Roman" w:hAnsi="Times New Roman" w:eastAsia="Times New Roman" w:cs="Times New Roman"/>
       <w:color w:val="000000" w:themeColor="text1"/>
     </w:rPr>
     <w:tblPr>
@@ -19343,7 +19343,7 @@
       <w:spacing w:after="0" w:line="240" w:lineRule="auto"/>
     </w:pPr>
     <w:rPr>
-      <w:rFonts w:asciiTheme="majorHAnsi" w:eastAsiaTheme="majorEastAsia" w:hAnsiTheme="majorHAnsi" w:cstheme="majorBidi"/>
+      <w:rFonts w:ascii="Times New Roman" w:hAnsi="Times New Roman" w:eastAsia="Times New Roman" w:cs="Times New Roman"/>
       <w:color w:val="000000" w:themeColor="text1"/>
     </w:rPr>
     <w:tblPr>
@@ -19468,7 +19468,7 @@
       <w:spacing w:after="0" w:line="240" w:lineRule="auto"/>
     </w:pPr>
     <w:rPr>
-      <w:rFonts w:asciiTheme="majorHAnsi" w:eastAsiaTheme="majorEastAsia" w:hAnsiTheme="majorHAnsi" w:cstheme="majorBidi"/>
+      <w:rFonts w:ascii="Times New Roman" w:hAnsi="Times New Roman" w:eastAsia="Times New Roman" w:cs="Times New Roman"/>
       <w:color w:val="000000" w:themeColor="text1"/>
     </w:rPr>
     <w:tblPr>
@@ -19593,7 +19593,7 @@
       <w:spacing w:after="0" w:line="240" w:lineRule="auto"/>
     </w:pPr>
     <w:rPr>
-      <w:rFonts w:asciiTheme="majorHAnsi" w:eastAsiaTheme="majorEastAsia" w:hAnsiTheme="majorHAnsi" w:cstheme="majorBidi"/>
+      <w:rFonts w:ascii="Times New Roman" w:hAnsi="Times New Roman" w:eastAsia="Times New Roman" w:cs="Times New Roman"/>
       <w:color w:val="000000" w:themeColor="text1"/>
     </w:rPr>
     <w:tblPr>
@@ -19718,7 +19718,7 @@
       <w:spacing w:after="0" w:line="240" w:lineRule="auto"/>
     </w:pPr>
     <w:rPr>
-      <w:rFonts w:asciiTheme="majorHAnsi" w:eastAsiaTheme="majorEastAsia" w:hAnsiTheme="majorHAnsi" w:cstheme="majorBidi"/>
+      <w:rFonts w:ascii="Times New Roman" w:hAnsi="Times New Roman" w:eastAsia="Times New Roman" w:cs="Times New Roman"/>
       <w:color w:val="000000" w:themeColor="text1"/>
     </w:rPr>
     <w:tblPr>
@@ -19843,7 +19843,7 @@
       <w:spacing w:after="0" w:line="240" w:lineRule="auto"/>
     </w:pPr>
     <w:rPr>
-      <w:rFonts w:asciiTheme="majorHAnsi" w:eastAsiaTheme="majorEastAsia" w:hAnsiTheme="majorHAnsi" w:cstheme="majorBidi"/>
+      <w:rFonts w:ascii="Times New Roman" w:hAnsi="Times New Roman" w:eastAsia="Times New Roman" w:cs="Times New Roman"/>
       <w:color w:val="000000" w:themeColor="text1"/>
     </w:rPr>
     <w:tblPr>
@@ -19968,7 +19968,7 @@
       <w:spacing w:after="0" w:line="240" w:lineRule="auto"/>
     </w:pPr>
     <w:rPr>
-      <w:rFonts w:asciiTheme="majorHAnsi" w:eastAsiaTheme="majorEastAsia" w:hAnsiTheme="majorHAnsi" w:cstheme="majorBidi"/>
+      <w:rFonts w:ascii="Times New Roman" w:hAnsi="Times New Roman" w:eastAsia="Times New Roman" w:cs="Times New Roman"/>
       <w:color w:val="000000" w:themeColor="text1"/>
     </w:rPr>
     <w:tblPr>

</xml_diff>